<commit_message>
Align title, project types and years across the site
Three facts were inconsistent between the site, LinkedIn and the resumes:

- Title: the site said "Construction Project Management Consultant" while the
  resume sources said "Senior Construction Project Manager". Standardised on the
  latter, which is stronger for construction roles and is his own wording.
- Project types: residential, commercial and renovation were confirmed directly
  and appear in no source document, so they are stated here for the first time.
- Years: content/social-launch.md still claimed "more than 10 years", contradicting
  15+ everywhere else, and still described two of the three case studies as
  unfinished. Rewritten as canonical reference copy, with the standing rules
  stated at the top so it stops drifting out of sync.

The public resume download is regenerated to match. It stays scrubbed: no phone
number, no ZIP, no personal email.
</commit_message>
<xml_diff>
--- a/public/resume/Narciso_M_Dickson_Resume.docx
+++ b/public/resume/Narciso_M_Dickson_Resume.docx
@@ -100,7 +100,7 @@
         <w:ind w:left="0"/>
       </w:pPr>
       <w:r>
-        <w:t>PMP-certified Project/Program Manager with over 15 years of success leading complex construction and design projects, including multimillion-dollar portfolios. Highly skilled in managing the full project lifecycle, budget control, contract negotiation, and strategic team coordination. Expertly applies Predictive, Agile, and Hybrid methods to select the optimal project approach for efficient delivery. Also offers project controls &amp; scheduling, data analytics dashboards, and web design &amp; local SEO services.</w:t>
+        <w:t>PMP-certified construction project and program manager with 15+ years delivering residential, commercial, and renovation projects across multimillion-dollar portfolios. Skilled across the full project lifecycle: preconstruction planning, budget control, scheduling, procurement, contract negotiation, change orders, RFIs, risk, quality, and closeout. Applies predictive, Agile, and hybrid methods, and builds project-controls dashboards that surface cost and schedule risk early.</w:t>
       </w:r>
     </w:p>
     <w:p>
@@ -158,7 +158,7 @@
           <w:b/>
           <w:sz w:val="20"/>
         </w:rPr>
-        <w:t>Founder &amp; Construction Project Management Consultant | In Project LLC – Lehi, UT, USA | Jan. 2022 – Present</w:t>
+        <w:t>Founder &amp; Senior Construction Project Manager | In Project LLC – Lehi, UT, USA | Jan. 2022 – Present</w:t>
       </w:r>
     </w:p>
     <w:p>
@@ -179,7 +179,7 @@
         <w:rPr>
           <w:sz w:val="20"/>
         </w:rPr>
-        <w:t>Directed full project lifecycles, achieving 30% faster preparation through streamlined planning.</w:t>
+        <w:t>Directed full construction project lifecycles for residential, commercial, and renovation projects, achieving 30% faster preparation through streamlined planning.</w:t>
       </w:r>
     </w:p>
     <w:p>
@@ -339,7 +339,7 @@
         <w:rPr>
           <w:sz w:val="20"/>
         </w:rPr>
-        <w:t>Managed $30M+ in projects, coordinating 15+ multidisciplinary teams across 20+ annual projects.</w:t>
+        <w:t>Managed a $30M+ portfolio of residential, commercial, and renovation construction and design projects, coordinating 15+ multidisciplinary teams across 20+ annual projects.</w:t>
       </w:r>
     </w:p>
     <w:p>

</xml_diff>

<commit_message>
Lead the In Project role with the service, not the task
The first bullet described lifecycle work without saying what In Project
actually sells. The practice is construction project management consulting
built on a project-controls foundation - control and clarity is the offer, and
that is the language the In Project site leads with.

Split into two: the service first, then the lifecycle it covers.
</commit_message>
<xml_diff>
--- a/public/resume/Narciso_M_Dickson_Resume.docx
+++ b/public/resume/Narciso_M_Dickson_Resume.docx
@@ -165,7 +165,7 @@
         <w:rPr>
           <w:sz w:val="20"/>
         </w:rPr>
-        <w:t>Control residential, commercial, and renovation construction projects across the full lifecycle, from concept through closeout.</w:t>
+        <w:t>Provide construction project management consulting on a project-controls foundation, giving owners and teams control and clarity across residential, commercial, and renovation projects.</w:t>
       </w:r>
     </w:p>
     <w:p>
@@ -178,7 +178,7 @@
         <w:rPr>
           <w:sz w:val="20"/>
         </w:rPr>
-        <w:t>Manage and control schedules, budgets, milestones, and deliverables.</w:t>
+        <w:t>Control the full project lifecycle from concept through closeout: scope, budget, schedule, milestones, deliverables, procurement, change orders, RFIs, risk, and quality.</w:t>
       </w:r>
     </w:p>
     <w:p>

</xml_diff>